<commit_message>
Revise 'The Illusion of the Given' to align with the Canon View
- Relations are designated and empty too: Rovelli and Barad are resonances,
  not proofs; new paragraph citing MMK 14.8; 'relational ontology' and
  'groundlessness' wording removed.
- Emptiness enables nothing: section 7A and the conclusion rewritten
  (MMK 24.16-20; yujyate as 'fits').
- Dzogchen terms: 'the basis, primordially pure'; display has nothing behind
  it; rigpa as the knowing of the basis; thugs rje left unglossed;
  'self-luminous' and undefined 'nature' removed.
- Mipham's conventional rang rig kept as the author's confirmed reading and
  distinguished from Yogacara self-awareness.
- Pure vision not read as qualities already present in a ground.

Co-Authored-By: Claude Opus 5.5 <noreply@anthropic.com>
Claude-Session: https://claude.ai/code/session_01MKUz8iyYea4uKKCo6eDwns
</commit_message>
<xml_diff>
--- a/intersubjectivity-and-dependent-arising/The_Illusion_of_the_Given.docx
+++ b/intersubjectivity-and-dependent-arising/The_Illusion_of_the_Given.docx
@@ -251,7 +251,7 @@
           <w:i w:val="false"/>
           <w:iCs w:val="false"/>
         </w:rPr>
-        <w:t xml:space="preserve">) collapses. Furthermore, this deconstructive stance finds a striking parallel in contemporary post-foundational physics and philosophy of science—specifically Carlo Rovelli’s Relational Quantum Mechanics (RQM) and Karen Barad’s Agential Realism.</w:t>
+        <w:t xml:space="preserve">) collapses. Furthermore, this deconstructive stance finds resonances—not proofs—in contemporary physics and philosophy of science, specifically Carlo Rovelli’s Relational Quantum Mechanics (RQM) and Karen Barad’s Agential Realism. They are used here as illustrations. Read as ontologies in which relations are what is really there, they would only install a new floor.</w:t>
       </w:r>
     </w:p>
     <w:p>
@@ -265,7 +265,7 @@
           <w:i w:val="false"/>
           <w:iCs w:val="false"/>
         </w:rPr>
-        <w:t xml:space="preserve">Agreement does not require an ultimate substrate. Regularity does not require a foundational floor. When conditions vary, appearances shift not because observers decode a single, uncarved given differently, but because objects, observers, and channels of interaction co-emerge within dependently arisen, relational networks.</w:t>
+        <w:t xml:space="preserve">Agreement does not require an ultimate substrate. Regularity does not require a foundational floor. When conditions vary, appearances shift not because observers decode a single, uncarved given differently, but because objects, observers, and channels of interaction are designated together within dependent arising. The relations are as unfindable as the things related.</w:t>
       </w:r>
     </w:p>
     <w:p>
@@ -1221,7 +1221,7 @@
           <w:i w:val="false"/>
           <w:iCs w:val="false"/>
         </w:rPr>
-        <w:t xml:space="preserve">C. The Gelug Concession: The Nature of the Nominal Observed Basis (</w:t>
+        <w:t xml:space="preserve">C. The Gelug Concession: What the Nominal Observed Basis Is (</w:t>
       </w:r>
       <w:r>
         <w:rPr>
@@ -1528,7 +1528,7 @@
           <w:i w:val="false"/>
           <w:iCs w:val="false"/>
         </w:rPr>
-        <w:t xml:space="preserve">), which lets different perspectives be referred to one another. Its job is to coordinate, not to underlie. It does in Madhyamaka what cross-perspective coordination does in relational physics, not what a substance does in classical realism.</w:t>
+        <w:t xml:space="preserve">), which lets different perspectives be referred to one another. Its job is to coordinate, not to underlie. It does in Madhyamaka what cross-perspective coordination does in relational quantum mechanics, not what a substance does in classical realism.</w:t>
       </w:r>
     </w:p>
     <w:p>
@@ -1566,7 +1566,7 @@
           <w:i w:val="false"/>
           <w:iCs w:val="false"/>
         </w:rPr>
-        <w:t xml:space="preserve">While Prāsaṅgika-Madhyamaka uses relentless dialectics to deconstruct metaphysical claims and halt analysis at worldly convention, the Great Perfection (Dzogchen) articulates the experiential nature of appearances through a phenomenological vocabulary.</w:t>
+        <w:t xml:space="preserve">While Prāsaṅgika-Madhyamaka uses relentless dialectics to deconstruct metaphysical claims and halt analysis at worldly convention, the Great Perfection (Dzogchen) describes how appearances are met in experience, in a phenomenological vocabulary.</w:t>
       </w:r>
     </w:p>
     <w:p>
@@ -1578,7 +1578,7 @@
           <w:i w:val="false"/>
           <w:iCs w:val="false"/>
         </w:rPr>
-        <w:t xml:space="preserve">A. The Ground (</w:t>
+        <w:t xml:space="preserve">A. The Basis (</w:t>
       </w:r>
       <w:r>
         <w:rPr>
@@ -1592,7 +1592,7 @@
           <w:i w:val="false"/>
           <w:iCs w:val="false"/>
         </w:rPr>
-        <w:t xml:space="preserve">) is Not an Ontological Substrate (</w:t>
+        <w:t xml:space="preserve">) Is Not an Ontological Substrate (</w:t>
       </w:r>
       <w:r>
         <w:rPr>
@@ -1633,7 +1633,7 @@
           <w:i w:val="false"/>
           <w:iCs w:val="false"/>
         </w:rPr>
-        <w:t xml:space="preserve"> and clarified by Ju Mipham Rinpoche—the Ground (</w:t>
+        <w:t xml:space="preserve"> and clarified by Ju Mipham Rinpoche—the basis (</w:t>
       </w:r>
       <w:r>
         <w:rPr>
@@ -1647,7 +1647,7 @@
           <w:i w:val="false"/>
           <w:iCs w:val="false"/>
         </w:rPr>
-        <w:t xml:space="preserve">) is carefully distinguished from the </w:t>
+        <w:t xml:space="preserve">), primordially pure, is carefully distinguished from the </w:t>
       </w:r>
       <w:r>
         <w:rPr>
@@ -1692,7 +1692,21 @@
           <w:i w:val="false"/>
           <w:iCs w:val="false"/>
         </w:rPr>
-        <w:t xml:space="preserve">The Ground is described through three inseparable aspects: </w:t>
+        <w:t xml:space="preserve">The basis is described through three inseparable aspects: its essence (</w:t>
+      </w:r>
+      <w:r>
+        <w:rPr>
+          <w:i/>
+          <w:iCs/>
+        </w:rPr>
+        <w:t xml:space="preserve">ngo bo</w:t>
+      </w:r>
+      <w:r>
+        <w:rPr>
+          <w:i w:val="false"/>
+          <w:iCs w:val="false"/>
+        </w:rPr>
+        <w:t xml:space="preserve">), empty, which is </w:t>
       </w:r>
       <w:r>
         <w:rPr>
@@ -1722,7 +1736,21 @@
           <w:i w:val="false"/>
           <w:iCs w:val="false"/>
         </w:rPr>
-        <w:t xml:space="preserve">, its empty essence), </w:t>
+        <w:t xml:space="preserve">); its clarity (</w:t>
+      </w:r>
+      <w:r>
+        <w:rPr>
+          <w:i/>
+          <w:iCs/>
+        </w:rPr>
+        <w:t xml:space="preserve">rang bzhin</w:t>
+      </w:r>
+      <w:r>
+        <w:rPr>
+          <w:i w:val="false"/>
+          <w:iCs w:val="false"/>
+        </w:rPr>
+        <w:t xml:space="preserve">, often translated “nature”), which is </w:t>
       </w:r>
       <w:r>
         <w:rPr>
@@ -1752,16 +1780,16 @@
           <w:i w:val="false"/>
           <w:iCs w:val="false"/>
         </w:rPr>
-        <w:t xml:space="preserve">, its unceasing display), and </w:t>
-      </w:r>
-      <w:r>
-        <w:rPr>
-          <w:b/>
-          <w:bCs/>
-          <w:i w:val="false"/>
-          <w:iCs w:val="false"/>
-        </w:rPr>
-        <w:t xml:space="preserve">all-pervasive responsiveness</w:t>
+        <w:t xml:space="preserve">), appearing unobstructed; and </w:t>
+      </w:r>
+      <w:r>
+        <w:rPr>
+          <w:b/>
+          <w:bCs/>
+          <w:i w:val="false"/>
+          <w:iCs w:val="false"/>
+        </w:rPr>
+        <w:t xml:space="preserve">compassion</w:t>
       </w:r>
       <w:r>
         <w:rPr>
@@ -1782,7 +1810,21 @@
           <w:i w:val="false"/>
           <w:iCs w:val="false"/>
         </w:rPr>
-        <w:t xml:space="preserve">).</w:t>
+        <w:t xml:space="preserve">). This article takes up only the first two. It does not gloss </w:t>
+      </w:r>
+      <w:r>
+        <w:rPr>
+          <w:i/>
+          <w:iCs/>
+        </w:rPr>
+        <w:t xml:space="preserve">thugs rje</w:t>
+      </w:r>
+      <w:r>
+        <w:rPr>
+          <w:i w:val="false"/>
+          <w:iCs w:val="false"/>
+        </w:rPr>
+        <w:t xml:space="preserve"> as a cosmic force or as a responsiveness belonging to the basis.</w:t>
       </w:r>
     </w:p>
     <w:p>
@@ -1799,7 +1841,7 @@
           <w:i w:val="false"/>
           <w:iCs w:val="false"/>
         </w:rPr>
-        <w:t xml:space="preserve">Primordial purity ensures that the Ground is thoroughly devoid of substantial reality (</w:t>
+        <w:t xml:space="preserve">Primordial purity means that the basis is thoroughly devoid of substantial reality (</w:t>
       </w:r>
       <w:r>
         <w:rPr>
@@ -1813,7 +1855,7 @@
           <w:i w:val="false"/>
           <w:iCs w:val="false"/>
         </w:rPr>
-        <w:t xml:space="preserve">). It is not an uncarved block, a cosmic mind, or a metaphysical origin. The Ground is “ground” only relative to the path; in itself, it is free from all ontological extremes (</w:t>
+        <w:t xml:space="preserve">). It is not an uncarved block, a cosmic mind, or a metaphysical origin. Longchenpa says the basis is called a ground only from a relative point of view; in the true nature of things it is empty of being one, free from all extremes (</w:t>
       </w:r>
       <w:r>
         <w:rPr>
@@ -1827,7 +1869,7 @@
           <w:i w:val="false"/>
           <w:iCs w:val="false"/>
         </w:rPr>
-        <w:t xml:space="preserve">).</w:t>
+        <w:t xml:space="preserve">). “True nature” here means only the way things are, not an essence.</w:t>
       </w:r>
     </w:p>
     <w:p>
@@ -1894,7 +1936,7 @@
           <w:i w:val="false"/>
           <w:iCs w:val="false"/>
         </w:rPr>
-        <w:t xml:space="preserve">Appearances are characterized as the dynamic display (</w:t>
+        <w:t xml:space="preserve">Appearances are spoken of as display (</w:t>
       </w:r>
       <w:r>
         <w:rPr>
@@ -1922,7 +1964,7 @@
           <w:i w:val="false"/>
           <w:iCs w:val="false"/>
         </w:rPr>
-        <w:t xml:space="preserve">) of the ground, manifesting as </w:t>
+        <w:t xml:space="preserve">), manifesting as </w:t>
       </w:r>
       <w:r>
         <w:rPr>
@@ -1952,7 +1994,7 @@
           <w:i w:val="false"/>
           <w:iCs w:val="false"/>
         </w:rPr>
-        <w:t xml:space="preserve">).</w:t>
+        <w:t xml:space="preserve">). “Display” must not be heard as the display of something standing behind it. It means dependent arising, vivid and unobstructed, with nothing behind it.</w:t>
       </w:r>
     </w:p>
     <w:p>
@@ -2067,14 +2109,14 @@
           <w:i w:val="false"/>
           <w:iCs w:val="false"/>
         </w:rPr>
-        <w:t xml:space="preserve">Awareness is Not a Radiating Container:</w:t>
-      </w:r>
-      <w:r>
-        <w:rPr>
-          <w:i w:val="false"/>
-          <w:iCs w:val="false"/>
-        </w:rPr>
-        <w:t xml:space="preserve"> Pure awareness (</w:t>
+        <w:t xml:space="preserve">Awareness Is Not a Radiating Container:</w:t>
+      </w:r>
+      <w:r>
+        <w:rPr>
+          <w:i w:val="false"/>
+          <w:iCs w:val="false"/>
+        </w:rPr>
+        <w:t xml:space="preserve"> Rigpa (</w:t>
       </w:r>
       <w:r>
         <w:rPr>
@@ -2088,21 +2130,35 @@
           <w:i w:val="false"/>
           <w:iCs w:val="false"/>
         </w:rPr>
-        <w:t xml:space="preserve">) is not one half of this subject–object pair, nor is it a subtle mental substance that projects outer forms. When Dzogchen describes appearances as the display of rig pa, it means that the entire perceptual field, subject and object together, is not other than empty, luminous cognizance (</w:t>
-      </w:r>
-      <w:r>
-        <w:rPr>
-          <w:i/>
-          <w:iCs/>
-        </w:rPr>
-        <w:t xml:space="preserve">ngo bo stong pa, rang bzhin gsal ba</w:t>
-      </w:r>
-      <w:r>
-        <w:rPr>
-          <w:i w:val="false"/>
-          <w:iCs w:val="false"/>
-        </w:rPr>
-        <w:t xml:space="preserve">). This is not a further substance underlying the field but the field’s own mode of being, itself empty.</w:t>
+        <w:t xml:space="preserve">) is not one half of this subject–object pair, nor a subtle mental substance that projects outer forms, nor a ground behind appearing. It is taken here as the knowing of the basis: recognising appearing as unfixed, dependent and empty. The clarity of appearing (</w:t>
+      </w:r>
+      <w:r>
+        <w:rPr>
+          <w:i/>
+          <w:iCs/>
+        </w:rPr>
+        <w:t xml:space="preserve">rang bzhin gsal ba</w:t>
+      </w:r>
+      <w:r>
+        <w:rPr>
+          <w:i w:val="false"/>
+          <w:iCs w:val="false"/>
+        </w:rPr>
+        <w:t xml:space="preserve">) is the appearing’s own, not light borrowed from a knower, and like the appearing it is empty (</w:t>
+      </w:r>
+      <w:r>
+        <w:rPr>
+          <w:i/>
+          <w:iCs/>
+        </w:rPr>
+        <w:t xml:space="preserve">ngo bo stong pa</w:t>
+      </w:r>
+      <w:r>
+        <w:rPr>
+          <w:i w:val="false"/>
+          <w:iCs w:val="false"/>
+        </w:rPr>
+        <w:t xml:space="preserve">).</w:t>
       </w:r>
     </w:p>
     <w:p>
@@ -2128,7 +2184,7 @@
           <w:i w:val="false"/>
           <w:iCs w:val="false"/>
         </w:rPr>
-        <w:t xml:space="preserve"> The Ground does not “generate” appearances as a cause produces an effect. Spontaneous presence (</w:t>
+        <w:t xml:space="preserve"> The basis does not “generate” appearances as a cause produces an effect. Spontaneous presence (</w:t>
       </w:r>
       <w:r>
         <w:rPr>
@@ -2142,7 +2198,7 @@
           <w:i w:val="false"/>
           <w:iCs w:val="false"/>
         </w:rPr>
-        <w:t xml:space="preserve">) is not an unconditioned creative source churning out conditioned objects. Rather, appearances are unproduced, self-luminous radiance, empty from the very moment of their arising.</w:t>
+        <w:t xml:space="preserve">) is not an unconditioned creative source churning out conditioned objects. Rather, appearing is already complete, owing its completeness to nothing hidden, and it is empty from the very moment it appears.</w:t>
       </w:r>
     </w:p>
     <w:p>
@@ -2410,7 +2466,21 @@
           <w:i w:val="false"/>
           <w:iCs w:val="false"/>
         </w:rPr>
-        <w:t xml:space="preserve">) to account for memory and immediate cognitive experience without spawning an infinite regress of secondary witness-consciousnesses.</w:t>
+        <w:t xml:space="preserve">) to account for memory and immediate cognitive experience without spawning an infinite regress of secondary witness-consciousnesses. This is not the Yogācāra self-awareness Candrakīrti refuted, which was offered as proof of a really existing, other-dependent consciousness. Mipham’s </w:t>
+      </w:r>
+      <w:r>
+        <w:rPr>
+          <w:i/>
+          <w:iCs/>
+        </w:rPr>
+        <w:t xml:space="preserve">rang rig</w:t>
+      </w:r>
+      <w:r>
+        <w:rPr>
+          <w:i w:val="false"/>
+          <w:iCs w:val="false"/>
+        </w:rPr>
+        <w:t xml:space="preserve"> is a convention, and empty like every convention.</w:t>
       </w:r>
     </w:p>
     <w:p>
@@ -2427,7 +2497,7 @@
           <w:i w:val="false"/>
           <w:iCs w:val="false"/>
         </w:rPr>
-        <w:t xml:space="preserve">In Dzogchen, the self-knowing nature of </w:t>
+        <w:t xml:space="preserve">In Dzogchen, the self-knowing of </w:t>
       </w:r>
       <w:r>
         <w:rPr>
@@ -2441,7 +2511,7 @@
           <w:i w:val="false"/>
           <w:iCs w:val="false"/>
         </w:rPr>
-        <w:t xml:space="preserve"> is not an intrinsically real subject knowing itself as an intentional object; it is the natural absence of delusion (</w:t>
+        <w:t xml:space="preserve"> is not an intrinsically real subject knowing itself as an intentional object. It is the natural absence of delusion (</w:t>
       </w:r>
       <w:r>
         <w:rPr>
@@ -2455,7 +2525,62 @@
           <w:i w:val="false"/>
           <w:iCs w:val="false"/>
         </w:rPr>
-        <w:t xml:space="preserve">)—the immediate, unconstructed lucidity of awareness recognizing its own empty display.</w:t>
+        <w:t xml:space="preserve">): the immediate, unconstructed lucidity of recognising appearing as empty display, belonging to no one.</w:t>
+      </w:r>
+    </w:p>
+    <w:p>
+      <w:pPr>
+        <w:pStyle w:val="Body"/>
+        <w:keepNext w:val="false"/>
+      </w:pPr>
+      <w:r>
+        <w:rPr>
+          <w:i w:val="false"/>
+          <w:iCs w:val="false"/>
+        </w:rPr>
+        <w:t xml:space="preserve">This reading of Mipham is the author’s, from repeated study of the </w:t>
+      </w:r>
+      <w:r>
+        <w:rPr>
+          <w:i/>
+          <w:iCs/>
+        </w:rPr>
+        <w:t xml:space="preserve">Beacon of Certainty</w:t>
+      </w:r>
+      <w:r>
+        <w:rPr>
+          <w:i w:val="false"/>
+          <w:iCs w:val="false"/>
+        </w:rPr>
+        <w:t xml:space="preserve"> and his commentary on Śāntarakṣita’s </w:t>
+      </w:r>
+      <w:r>
+        <w:rPr>
+          <w:i/>
+          <w:iCs/>
+        </w:rPr>
+        <w:t xml:space="preserve">Madhyamakālaṃkāra</w:t>
+      </w:r>
+      <w:r>
+        <w:rPr>
+          <w:i w:val="false"/>
+          <w:iCs w:val="false"/>
+        </w:rPr>
+        <w:t xml:space="preserve">. </w:t>
+      </w:r>
+      <w:r>
+        <w:rPr>
+          <w:i/>
+          <w:iCs/>
+        </w:rPr>
+        <w:t xml:space="preserve">The Observer and the Taste of Presence</w:t>
+      </w:r>
+      <w:r>
+        <w:rPr>
+          <w:i w:val="false"/>
+          <w:iCs w:val="false"/>
+        </w:rPr>
+        <w:t xml:space="preserve"> (Chapter 19) presents the Mipham, Gorampa and Higgins readings as open. This article takes Mipham’s side on the conventional status of self-knowing, and on that point only.</w:t>
       </w:r>
     </w:p>
     <w:p>
@@ -2956,21 +3081,7 @@
           <w:i w:val="false"/>
           <w:iCs w:val="false"/>
         </w:rPr>
-        <w:t xml:space="preserve">); it is not access to a metaphysical bedrock behind appearance. In Dzogchen, spontaneous presence (</w:t>
-      </w:r>
-      <w:r>
-        <w:rPr>
-          <w:i/>
-          <w:iCs/>
-        </w:rPr>
-        <w:t xml:space="preserve">lhun grub</w:t>
-      </w:r>
-      <w:r>
-        <w:rPr>
-          <w:i w:val="false"/>
-          <w:iCs w:val="false"/>
-        </w:rPr>
-        <w:t xml:space="preserve">) asserts that phenomena are primordially pure and complete as the mandala of deities and wisdoms at the level of appearance. Because the deity Māmakī is completely devoid of inherent existence (</w:t>
+        <w:t xml:space="preserve">); it is not access to a metaphysical bedrock behind appearance. In Mipham’s presentation, pure vision meets appearances as the mandala of deities and wisdoms. This article does not read that as qualities already present in a ground, waiting to be uncovered. It reads it as how appearing is met when nothing in it is being fixed. Because the deity Māmakī is completely devoid of inherent existence (</w:t>
       </w:r>
       <w:r>
         <w:rPr>
@@ -3009,20 +3120,20 @@
           <w:i w:val="false"/>
           <w:iCs w:val="false"/>
         </w:rPr>
-        <w:t xml:space="preserve">Modern Relationalism: Rovelli, Barad, and Cross-Perspective Consistency</w:t>
-      </w:r>
-    </w:p>
-    <w:p>
-      <w:pPr>
-        <w:pStyle w:val="Body"/>
-        <w:keepNext w:val="false"/>
-      </w:pPr>
-      <w:r>
-        <w:rPr>
-          <w:i w:val="false"/>
-          <w:iCs w:val="false"/>
-        </w:rPr>
-        <w:t xml:space="preserve">This dissolution of the given without falling into subjective idealism is mirrored in contemporary post-foundational physics and relational epistemology.</w:t>
+        <w:t xml:space="preserve">Resonances in Physics: Rovelli, Barad, and Cross-Perspective Consistency</w:t>
+      </w:r>
+    </w:p>
+    <w:p>
+      <w:pPr>
+        <w:pStyle w:val="Body"/>
+        <w:keepNext w:val="false"/>
+      </w:pPr>
+      <w:r>
+        <w:rPr>
+          <w:i w:val="false"/>
+          <w:iCs w:val="false"/>
+        </w:rPr>
+        <w:t xml:space="preserve">This dissolution of the given without falling into subjective idealism has resonances in contemporary physics and philosophy of science. They are resonances, not proofs. Emptiness does not need physics, and a physical description is itself a designation, one of the most reliable we have within its domain.</w:t>
       </w:r>
     </w:p>
     <w:p>
@@ -3264,7 +3375,7 @@
           <w:i w:val="false"/>
           <w:iCs w:val="false"/>
         </w:rPr>
-        <w:t xml:space="preserve">Some critics argue that CPL seems to concede a shared structure of stable facts across perspectives. This is less a concession than a confirmation of the relational thesis: agreement between two observers does </w:t>
+        <w:t xml:space="preserve">Some critics argue that CPL seems to concede a shared structure of stable facts across perspectives. This is less a concession than a confirmation of the point made here: agreement between two observers does </w:t>
       </w:r>
       <w:r>
         <w:rPr>
@@ -3279,6 +3390,20 @@
           <w:iCs w:val="false"/>
         </w:rPr>
         <w:t xml:space="preserve"> require an unmeasured, classical state to have existed prior to interaction. Rather, agreement is established via physical interaction channels between the observers themselves. Intersubjective coherence is produced through horizontal relational coordination and cross-checking—a close counterpart of Candrakīrti’s corroboration among sound faculties (§2B)—not by anchoring to an absolute classical substrate.</w:t>
+      </w:r>
+    </w:p>
+    <w:p>
+      <w:pPr>
+        <w:pStyle w:val="Body"/>
+        <w:keepNext w:val="false"/>
+        <w:ind w:firstLine="340"/>
+      </w:pPr>
+      <w:r>
+        <w:rPr>
+          <w:i w:val="false"/>
+          <w:iCs w:val="false"/>
+        </w:rPr>
+        <w:t xml:space="preserve">One caution governs this whole section. Neither RQM nor agential realism should be read as saying that relations are what is really there. Barad makes the phenomenon the primary ontological unit; read as an ontology, that repeats at the level of relation the substantialism it set out to overcome. Nāgārjuna examined connection itself: “coming into contact, having come into contact, and the one who brings them into contact are not found” (MMK 14.8). Relations and relata are designated together; neither is prior, and neither is the ground. What the physics offers is an illustration of agreement without a pre-existing common object, not a new floor made of relations.</w:t>
       </w:r>
     </w:p>
     <w:p>
@@ -3720,7 +3845,7 @@
           <w:i w:val="false"/>
           <w:iCs w:val="false"/>
         </w:rPr>
-        <w:t xml:space="preserve">. It is not erased from conventional existence merely because an uncoupled observer fails to register it. But what that basis manifests as—whether an impenetrable barrier, fluid nourishment, burning pus, or an uncoupled passage—depends entirely on the relational channels enacted in the encounter, with the human frame coordinating the terms of comparison.</w:t>
+        <w:t xml:space="preserve">. It is not erased from conventional existence merely because an uncoupled observer fails to register it. But what appears there—an impenetrable barrier, fluid nourishment, burning pus, or an uncoupled passage—depends entirely on the channels enacted in the encounter. The “basis” is only the human frame’s name for the place where these appearances are compared. It is not something underneath that manifests as them.</w:t>
       </w:r>
     </w:p>
     <w:p>
@@ -3947,7 +4072,7 @@
           <w:i w:val="false"/>
           <w:iCs w:val="false"/>
         </w:rPr>
-        <w:t xml:space="preserve">When space ceases to be an absolute warehouse, the puzzle of how an object can appear differently across species dissolves. Space, time, observer, and observed are all mutually dependent threads within a single, dynamic web of conditions.</w:t>
+        <w:t xml:space="preserve">When space ceases to be an absolute warehouse, the puzzle of how an object can appear differently across species dissolves. Space, time, observer and observed are designated together, and none is the container of the others. The “web” that links them is a designation too, not a further thing.</w:t>
       </w:r>
     </w:p>
     <w:p>
@@ -3985,7 +4110,7 @@
           <w:i w:val="false"/>
           <w:iCs w:val="false"/>
         </w:rPr>
-        <w:t xml:space="preserve">This brings the inquiry to the fundamental question that realism poses against relational ontology: “If there is no ultimate, objective ground, why is there an orderly, reliable web of conditions at all? Why do conditions cohere into predictable laws, regularities, and repeatable experiences rather than collapsing into chaotic noise?”</w:t>
+        <w:t xml:space="preserve">This brings the inquiry to the fundamental question that realism poses against a view without a foundation: “If there is no ultimate, objective ground, why is there an orderly, reliable web of conditions at all? Why do conditions cohere into predictable laws, regularities, and repeatable experiences rather than collapsing into chaotic noise?”</w:t>
       </w:r>
     </w:p>
     <w:p>
@@ -4131,16 +4256,23 @@
           <w:i w:val="false"/>
           <w:iCs w:val="false"/>
         </w:rPr>
-        <w:t xml:space="preserve">). To say a convention is empty of inherent existence does not mean it is arbitrary or lawless. Emptiness is not the negation of cause and effect; </w:t>
-      </w:r>
-      <w:r>
-        <w:rPr>
-          <w:b/>
-          <w:bCs/>
-          <w:i w:val="false"/>
-          <w:iCs w:val="false"/>
-        </w:rPr>
-        <w:t xml:space="preserve">emptiness is the very condition that allows cause and effect to function.</w:t>
+        <w:t xml:space="preserve">). To say a convention is empty of inherent existence does not mean it is arbitrary or lawless. Emptiness is not the negation of cause and effect. Nor is it what makes cause and effect work: </w:t>
+      </w:r>
+      <w:r>
+        <w:rPr>
+          <w:b/>
+          <w:bCs/>
+          <w:i w:val="false"/>
+          <w:iCs w:val="false"/>
+        </w:rPr>
+        <w:t xml:space="preserve">emptiness enables nothing and explains nothing.</w:t>
+      </w:r>
+      <w:r>
+        <w:rPr>
+          <w:i w:val="false"/>
+          <w:iCs w:val="false"/>
+        </w:rPr>
+        <w:t xml:space="preserve"> The point runs the other way. Function never needed an essence, and a thing with an essence of its own could not arise, change or cease (MMK 24.16–20).</w:t>
       </w:r>
     </w:p>
     <w:p>
@@ -4224,7 +4356,7 @@
           <w:i w:val="false"/>
           <w:iCs w:val="false"/>
         </w:rPr>
-        <w:t xml:space="preserve">Infinite Regress vs. Groundlessness:</w:t>
+        <w:t xml:space="preserve">Infinite Regress vs. No Foundation:</w:t>
       </w:r>
       <w:r>
         <w:rPr>
@@ -4259,7 +4391,7 @@
           <w:i w:val="false"/>
           <w:iCs w:val="false"/>
         </w:rPr>
-        <w:t xml:space="preserve">). An infinite series of conditions is an ontological failure only if one is seeking a foundational resting place. In a relational ontology, the absence of a first beginning is simply the natural signature of groundlessness.</w:t>
+        <w:t xml:space="preserve">). An infinite series of conditions is an ontological failure only if one is seeking a foundational resting place. Once no foundational resting place is being sought, the absence of a first beginning is no defect. It is simply what dependent arising looks like when no ground is demanded of it.</w:t>
       </w:r>
     </w:p>
     <w:p>
@@ -4293,7 +4425,7 @@
           <w:i w:val="false"/>
           <w:iCs w:val="false"/>
         </w:rPr>
-        <w:t xml:space="preserve">Conclusion: Groundless Functionality</w:t>
+        <w:t xml:space="preserve">Conclusion: Functioning Without a Foundation</w:t>
       </w:r>
     </w:p>
     <w:p>
@@ -4413,7 +4545,21 @@
           <w:i w:val="false"/>
           <w:iCs w:val="false"/>
         </w:rPr>
-        <w:t xml:space="preserve">In the Prāsaṅgika dialectic, this groundlessness is the supreme affirmation of conventional efficacy:</w:t>
+        <w:t xml:space="preserve">In the Prāsaṅgika dialectic, the absence of a foundation takes nothing away from conventional efficacy. Nāgārjuna’s verb is </w:t>
+      </w:r>
+      <w:r>
+        <w:rPr>
+          <w:i/>
+          <w:iCs/>
+        </w:rPr>
+        <w:t xml:space="preserve">yujyate</w:t>
+      </w:r>
+      <w:r>
+        <w:rPr>
+          <w:i w:val="false"/>
+          <w:iCs w:val="false"/>
+        </w:rPr>
+        <w:t xml:space="preserve">, “fits” or “works”:</w:t>
       </w:r>
     </w:p>
     <w:p>
@@ -4478,7 +4624,7 @@
           <w:i w:val="false"/>
           <w:iCs w:val="false"/>
         </w:rPr>
-        <w:t xml:space="preserve">And from the experiential perspective of non-foundational Dzogchen, when appearances are recognized as self-display (</w:t>
+        <w:t xml:space="preserve">And from the experiential side of Dzogchen, when appearances are recognized as self-display (</w:t>
       </w:r>
       <w:r>
         <w:rPr>
@@ -4492,7 +4638,7 @@
           <w:i w:val="false"/>
           <w:iCs w:val="false"/>
         </w:rPr>
-        <w:t xml:space="preserve">), free from the dualistic friction of an inherent subject grasping at an inherent object, the display of appearances is experienced in its primordially pure nature: unoriginated, unconstructed, and vividly present. Conventional reality does not endure </w:t>
+        <w:t xml:space="preserve">), with no inherent subject grasping at an inherent object, appearing is met as it always was: vivid, unproduced and not found. Conventional reality does not endure </w:t>
       </w:r>
       <w:r>
         <w:rPr>
@@ -4506,7 +4652,21 @@
           <w:i w:val="false"/>
           <w:iCs w:val="false"/>
         </w:rPr>
-        <w:t xml:space="preserve"> of having no foundation; it is precisely because reality is free from any foundation that it is capable of appearing at all.</w:t>
+        <w:t xml:space="preserve"> of having no foundation, and it does not appear </w:t>
+      </w:r>
+      <w:r>
+        <w:rPr>
+          <w:i/>
+          <w:iCs/>
+        </w:rPr>
+        <w:t xml:space="preserve">because</w:t>
+      </w:r>
+      <w:r>
+        <w:rPr>
+          <w:i w:val="false"/>
+          <w:iCs w:val="false"/>
+        </w:rPr>
+        <w:t xml:space="preserve"> it has none. It never needed one.</w:t>
       </w:r>
     </w:p>
     <w:sectPr>

</xml_diff>

<commit_message>
The Illusion of the Given v3: answer Vasubandhu, other minds, circularity, language, cross-realm interaction, ethics
- New 2D: the bowl is Vasubandhu's example (Vimsika) for mind-only; Candrakirti's
  reply that pus and the seeing of it stand or fall together.
- New section 3, Other Observers: other minds (Dharmakirti's Santanantarasiddhi,
  Ratnakirti's Santanantaradusana; the asymmetry refused); is agreement circular
  (Wittgenstein, PI 241-242); language as the human frame's bookkeeping.
- New 6D: the water offering to pretas read without a substance that travels.
- Conclusion: compassion without a self behind it.
- Physics bullets trimmed; sections 3-7 renumbered 4-8.

Co-Authored-By: Claude Opus 5.5 <noreply@anthropic.com>
Claude-Session: https://claude.ai/code/session_01MKUz8iyYea4uKKCo6eDwns
</commit_message>
<xml_diff>
--- a/intersubjectivity-and-dependent-arising/The_Illusion_of_the_Given.docx
+++ b/intersubjectivity-and-dependent-arising/The_Illusion_of_the_Given.docx
@@ -1533,6 +1533,87 @@
     </w:p>
     <w:p>
       <w:pPr>
+        <w:pStyle w:val="Heading2"/>
+      </w:pPr>
+      <w:r>
+        <w:rPr>
+          <w:i w:val="false"/>
+          <w:iCs w:val="false"/>
+        </w:rPr>
+        <w:t xml:space="preserve">D. The Bowl’s First Owner: Vasubandhu, and Candrakīrti’s Reply</w:t>
+      </w:r>
+    </w:p>
+    <w:p>
+      <w:pPr>
+        <w:pStyle w:val="Body"/>
+        <w:keepNext w:val="false"/>
+      </w:pPr>
+      <w:r>
+        <w:rPr>
+          <w:i w:val="false"/>
+          <w:iCs w:val="false"/>
+        </w:rPr>
+        <w:t xml:space="preserve">The bowl did not begin as a Madhyamaka example. In his </w:t>
+      </w:r>
+      <w:r>
+        <w:rPr>
+          <w:i/>
+          <w:iCs/>
+        </w:rPr>
+        <w:t xml:space="preserve">Twenty Verses</w:t>
+      </w:r>
+      <w:r>
+        <w:rPr>
+          <w:i w:val="false"/>
+          <w:iCs w:val="false"/>
+        </w:rPr>
+        <w:t xml:space="preserve"> (</w:t>
+      </w:r>
+      <w:r>
+        <w:rPr>
+          <w:i/>
+          <w:iCs/>
+        </w:rPr>
+        <w:t xml:space="preserve">Viṃśikā</w:t>
+      </w:r>
+      <w:r>
+        <w:rPr>
+          <w:i w:val="false"/>
+          <w:iCs w:val="false"/>
+        </w:rPr>
+        <w:t xml:space="preserve">), Vasubandhu uses the hungry ghosts to answer an objection to Mind-Only. If there are no external objects, why do appearances agree? Why do many beings see the same thing, at the same place and time? His reply: just as hungry ghosts with similar karma together see a river of pus, so the shared ripening of karma in consciousness accounts for shared appearances. No river outside the mind is needed.</w:t>
+      </w:r>
+    </w:p>
+    <w:p>
+      <w:pPr>
+        <w:pStyle w:val="Body"/>
+        <w:keepNext w:val="false"/>
+        <w:ind w:firstLine="340"/>
+      </w:pPr>
+      <w:r>
+        <w:rPr>
+          <w:i w:val="false"/>
+          <w:iCs w:val="false"/>
+        </w:rPr>
+        <w:t xml:space="preserve">That is this article’s question, answered by making consciousness the floor. Candrakīrti’s examination of Mind-Only (MA 6.45–6.97) turns the example around. If the pus has no standing because it is not external, the cognition of pus has no better standing, since object and cognition are designated together (§2A). For the preta, the river of pus and the seeing of it stand or fall together: conventionally both exist, and under analysis neither is found. So the bowl does not show that the world is in the mind. It shows that neither the world nor the mind is the floor. Shared karma, as karmic vision (</w:t>
+      </w:r>
+      <w:r>
+        <w:rPr>
+          <w:i/>
+          <w:iCs/>
+        </w:rPr>
+        <w:t xml:space="preserve">las snang</w:t>
+      </w:r>
+      <w:r>
+        <w:rPr>
+          <w:i w:val="false"/>
+          <w:iCs w:val="false"/>
+        </w:rPr>
+        <w:t xml:space="preserve">), remains part of the account of agreement, but as a condition among conditions, not as a storehouse consciousness in which appearances are really kept.</w:t>
+      </w:r>
+    </w:p>
+    <w:p>
+      <w:pPr>
         <w:pStyle w:val="Heading1"/>
         <w:tabs>
           <w:tab w:val="left" w:pos="454"/>
@@ -1544,6 +1625,245 @@
           <w:color w:val="5A2A1E"/>
         </w:rPr>
         <w:t xml:space="preserve">3.</w:t>
+      </w:r>
+      <w:r>
+        <w:t xml:space="preserve">	</w:t>
+      </w:r>
+      <w:r>
+        <w:rPr>
+          <w:i w:val="false"/>
+          <w:iCs w:val="false"/>
+        </w:rPr>
+        <w:t xml:space="preserve">Other Observers</w:t>
+      </w:r>
+    </w:p>
+    <w:p>
+      <w:pPr>
+        <w:pStyle w:val="Body"/>
+        <w:keepNext w:val="false"/>
+      </w:pPr>
+      <w:r>
+        <w:rPr>
+          <w:i w:val="false"/>
+          <w:iCs w:val="false"/>
+        </w:rPr>
+        <w:t xml:space="preserve">Agreement presupposes others to agree with. Three questions follow: how other observers are known at all, whether the account of agreement is circular, and what part language plays.</w:t>
+      </w:r>
+    </w:p>
+    <w:p>
+      <w:pPr>
+        <w:pStyle w:val="Heading2"/>
+      </w:pPr>
+      <w:r>
+        <w:rPr>
+          <w:i w:val="false"/>
+          <w:iCs w:val="false"/>
+        </w:rPr>
+        <w:t xml:space="preserve">A. Other Minds</w:t>
+      </w:r>
+    </w:p>
+    <w:p>
+      <w:pPr>
+        <w:pStyle w:val="Body"/>
+        <w:keepNext w:val="false"/>
+      </w:pPr>
+      <w:r>
+        <w:rPr>
+          <w:i w:val="false"/>
+          <w:iCs w:val="false"/>
+        </w:rPr>
+        <w:t xml:space="preserve">Intersubjectivity assumes there are other observers whose appearances could agree with mine. How is that known? Buddhist epistemology treated this as a question in its own right. Dharmakīrti’s </w:t>
+      </w:r>
+      <w:r>
+        <w:rPr>
+          <w:i/>
+          <w:iCs/>
+        </w:rPr>
+        <w:t xml:space="preserve">Proof of Other Mental Continua</w:t>
+      </w:r>
+      <w:r>
+        <w:rPr>
+          <w:i w:val="false"/>
+          <w:iCs w:val="false"/>
+        </w:rPr>
+        <w:t xml:space="preserve"> (</w:t>
+      </w:r>
+      <w:r>
+        <w:rPr>
+          <w:i/>
+          <w:iCs/>
+        </w:rPr>
+        <w:t xml:space="preserve">Santānāntarasiddhi</w:t>
+      </w:r>
+      <w:r>
+        <w:rPr>
+          <w:i w:val="false"/>
+          <w:iCs w:val="false"/>
+        </w:rPr>
+        <w:t xml:space="preserve">) argues by inference: other bodies act and speak with purpose, as mine does when I intend something, so other streams of mind are inferred from their activity. Ratnakīrti, writing later on Mind-Only premises, answered with a </w:t>
+      </w:r>
+      <w:r>
+        <w:rPr>
+          <w:i/>
+          <w:iCs/>
+        </w:rPr>
+        <w:t xml:space="preserve">Refutation of Other Mental Continua</w:t>
+      </w:r>
+      <w:r>
+        <w:rPr>
+          <w:i w:val="false"/>
+          <w:iCs w:val="false"/>
+        </w:rPr>
+        <w:t xml:space="preserve"> (</w:t>
+      </w:r>
+      <w:r>
+        <w:rPr>
+          <w:i/>
+          <w:iCs/>
+        </w:rPr>
+        <w:t xml:space="preserve">Santānāntaradūṣaṇa</w:t>
+      </w:r>
+      <w:r>
+        <w:rPr>
+          <w:i w:val="false"/>
+          <w:iCs w:val="false"/>
+        </w:rPr>
+        <w:t xml:space="preserve">), arguing that other minds cannot finally be established.</w:t>
+      </w:r>
+    </w:p>
+    <w:p>
+      <w:pPr>
+        <w:pStyle w:val="Body"/>
+        <w:keepNext w:val="false"/>
+        <w:ind w:firstLine="340"/>
+      </w:pPr>
+      <w:r>
+        <w:rPr>
+          <w:i w:val="false"/>
+          <w:iCs w:val="false"/>
+        </w:rPr>
+        <w:t xml:space="preserve">Both texts share an assumption that this article rejects: my own stream is given, and others are inferred or doubtful. Madhyamaka refuses the asymmetry. My mental continuum is no more found under analysis than yours; both are designated in dependence on aggregates, and both function. The certainty I feel about “my” experience and the doubt I feel about “yours” are the substantialist habit turned inward, making the self the one indubitable floor (Book 4, Chapter 1). Conventionally, the world acknowledges other minds as plainly as it acknowledges tables, and no valid conventional cognition contradicts it. Other observers are not a conclusion drawn from a private starting point. They are designated together with this one, as long and short are.</w:t>
+      </w:r>
+    </w:p>
+    <w:p>
+      <w:pPr>
+        <w:pStyle w:val="Heading2"/>
+      </w:pPr>
+      <w:r>
+        <w:rPr>
+          <w:i w:val="false"/>
+          <w:iCs w:val="false"/>
+        </w:rPr>
+        <w:t xml:space="preserve">B. Is Agreement Circular?</w:t>
+      </w:r>
+    </w:p>
+    <w:p>
+      <w:pPr>
+        <w:pStyle w:val="Body"/>
+        <w:keepNext w:val="false"/>
+      </w:pPr>
+      <w:r>
+        <w:rPr>
+          <w:i w:val="false"/>
+          <w:iCs w:val="false"/>
+        </w:rPr>
+        <w:t xml:space="preserve">A critic can press §2B. Faculties count as sound when they agree with others of their class, and the class is defined by sharing those faculties. Standards set the class, and the class sets the standards. Is the account circular?</w:t>
+      </w:r>
+    </w:p>
+    <w:p>
+      <w:pPr>
+        <w:pStyle w:val="Body"/>
+        <w:keepNext w:val="false"/>
+        <w:ind w:firstLine="340"/>
+      </w:pPr>
+      <w:r>
+        <w:rPr>
+          <w:i w:val="false"/>
+          <w:iCs w:val="false"/>
+        </w:rPr>
+        <w:t xml:space="preserve">It is, and the circle is not a defect. It would be fatal only if agreement had to rest on something outside itself: a final certifier that is not one more participant. Madhyamaka denies there is one. The mutual dependence here is the same structure as means and objects of knowledge, each established only in relation to the other (Book 4, Chapter 5). Nothing is being derived from a foundation, so there is no foundation for the circle to lack. Wittgenstein reached a similar point from another direction. What makes rule-following possible is agreement “not in opinions but in form of life” (</w:t>
+      </w:r>
+      <w:r>
+        <w:rPr>
+          <w:i/>
+          <w:iCs/>
+        </w:rPr>
+        <w:t xml:space="preserve">Philosophical Investigations</w:t>
+      </w:r>
+      <w:r>
+        <w:rPr>
+          <w:i w:val="false"/>
+          <w:iCs w:val="false"/>
+        </w:rPr>
+        <w:t xml:space="preserve"> §241); and “if language is to be a means of communication there must be agreement not only in definitions but also (queer as this may sound) in judgments” (§242). Agreement is not evidence of an object behind it (Book 2, “The Formation of a Mountain”). It is the convention working.</w:t>
+      </w:r>
+    </w:p>
+    <w:p>
+      <w:pPr>
+        <w:pStyle w:val="Body"/>
+        <w:keepNext w:val="false"/>
+        <w:ind w:firstLine="340"/>
+      </w:pPr>
+      <w:r>
+        <w:rPr>
+          <w:i w:val="false"/>
+          <w:iCs w:val="false"/>
+        </w:rPr>
+        <w:t xml:space="preserve">The circle does not make error impossible. Within it, correction is real: the jaundiced eye is corrected by others, a misreading by a second look. What the circle rules out is only a correction from outside every frame.</w:t>
+      </w:r>
+    </w:p>
+    <w:p>
+      <w:pPr>
+        <w:pStyle w:val="Heading2"/>
+      </w:pPr>
+      <w:r>
+        <w:rPr>
+          <w:i w:val="false"/>
+          <w:iCs w:val="false"/>
+        </w:rPr>
+        <w:t xml:space="preserve">C. Language</w:t>
+      </w:r>
+    </w:p>
+    <w:p>
+      <w:pPr>
+        <w:pStyle w:val="Body"/>
+        <w:keepNext w:val="false"/>
+      </w:pPr>
+      <w:r>
+        <w:rPr>
+          <w:i w:val="false"/>
+          <w:iCs w:val="false"/>
+        </w:rPr>
+        <w:t xml:space="preserve">For human beings the frame that does the bookkeeping is, to a large degree, a language. Designations are learned from others, corrected by others and shared with others. A child learns “water” as a word that works: when it is said, a glass is brought. That is why humans agree so finely, not only that the liquid is there, but that it is water, that it is cold, and that it is the same water as yesterday’s.</w:t>
+      </w:r>
+    </w:p>
+    <w:p>
+      <w:pPr>
+        <w:pStyle w:val="Body"/>
+        <w:keepNext w:val="false"/>
+        <w:ind w:firstLine="340"/>
+      </w:pPr>
+      <w:r>
+        <w:rPr>
+          <w:i w:val="false"/>
+          <w:iCs w:val="false"/>
+        </w:rPr>
+        <w:t xml:space="preserve">Designation is wider than language (Book 4, Chapter 6). Animals designate by perception and response, without words, and their worlds are coordinated too. But language carries the human circle of agreement across times and places that no single perception could reach. It is also where the substantialist habit is most fluent: the noun “the bowl” seems to point to something standing behind every view of it (§1). The same tool that coordinates human worlds tempts us to believe it describes the one world behind them.</w:t>
+      </w:r>
+    </w:p>
+    <w:p>
+      <w:pPr>
+        <w:pStyle w:val="Heading1"/>
+        <w:tabs>
+          <w:tab w:val="left" w:pos="454"/>
+        </w:tabs>
+        <w:ind w:left="454" w:hanging="454"/>
+      </w:pPr>
+      <w:r>
+        <w:rPr>
+          <w:color w:val="5A2A1E"/>
+        </w:rPr>
+        <w:t xml:space="preserve">4.</w:t>
       </w:r>
       <w:r>
         <w:t xml:space="preserve">	</w:t>
@@ -3110,7 +3430,7 @@
         <w:rPr>
           <w:color w:val="5A2A1E"/>
         </w:rPr>
-        <w:t xml:space="preserve">4.</w:t>
+        <w:t xml:space="preserve">5.</w:t>
       </w:r>
       <w:r>
         <w:t xml:space="preserve">	</w:t>
@@ -3418,7 +3738,7 @@
         <w:rPr>
           <w:color w:val="5A2A1E"/>
         </w:rPr>
-        <w:t xml:space="preserve">5.</w:t>
+        <w:t xml:space="preserve">6.</w:t>
       </w:r>
       <w:r>
         <w:t xml:space="preserve">	</w:t>
@@ -3663,21 +3983,7 @@
           <w:i w:val="false"/>
           <w:iCs w:val="false"/>
         </w:rPr>
-        <w:t xml:space="preserve"> Consider dark matter passing through the Earth. As far as current empirical observations show, dark matter does not couple to the electromagnetic force, so it passes through the ~12,700 kilometers of the Earth’s dense crust and mantle without friction, collision, or mechanical resistance. To an electromagnetic sensor, the Earth is an impenetrable barrier; to dark matter, that barrier does not exist. Yet dark matter </w:t>
-      </w:r>
-      <w:r>
-        <w:rPr>
-          <w:i/>
-          <w:iCs/>
-        </w:rPr>
-        <w:t xml:space="preserve">is</w:t>
-      </w:r>
-      <w:r>
-        <w:rPr>
-          <w:i w:val="false"/>
-          <w:iCs w:val="false"/>
-        </w:rPr>
-        <w:t xml:space="preserve"> coupled through the gravitational channel: its trajectory is bent by the Earth’s mass-energy.</w:t>
+        <w:t xml:space="preserve"> As far as current observation shows, dark matter does not couple to the electromagnetic force, so it passes through the Earth without collision or resistance. To an electromagnetic sensor the Earth is an impenetrable barrier; to dark matter that barrier does not exist. Yet its trajectory is bent by the Earth’s mass: it is coupled through gravity.</w:t>
       </w:r>
     </w:p>
     <w:p>
@@ -3703,7 +4009,7 @@
           <w:i w:val="false"/>
           <w:iCs w:val="false"/>
         </w:rPr>
-        <w:t xml:space="preserve"> A solar neutrino passes through vast expanses of lead with an extraordinarily low probability of interaction. The lead is neither an impenetrable wall nor non-existent; it is a region of extremely weak relational coupling.</w:t>
+        <w:t xml:space="preserve"> A solar neutrino crosses vast expanses of lead with an extraordinarily low chance of interacting. The lead is neither a wall nor nothing; it is a region of very weak coupling.</w:t>
       </w:r>
     </w:p>
     <w:p>
@@ -3850,6 +4156,73 @@
     </w:p>
     <w:p>
       <w:pPr>
+        <w:pStyle w:val="Heading2"/>
+      </w:pPr>
+      <w:r>
+        <w:rPr>
+          <w:i w:val="false"/>
+          <w:iCs w:val="false"/>
+        </w:rPr>
+        <w:t xml:space="preserve">D. Across Realms: The Water Offering</w:t>
+      </w:r>
+    </w:p>
+    <w:p>
+      <w:pPr>
+        <w:pStyle w:val="Body"/>
+        <w:keepNext w:val="false"/>
+      </w:pPr>
+      <w:r>
+        <w:rPr>
+          <w:i w:val="false"/>
+          <w:iCs w:val="false"/>
+        </w:rPr>
+        <w:t xml:space="preserve">The hardest test of the thesis is interaction between worlds, and Buddhist practice assumes it. In offerings of water and food to hungry ghosts, a practitioner blesses water with mantra and gives it, and the tradition holds that it reaches the pretas as nourishment rather than as pus. If each realm’s world arises within its own karmic vision, how can an act in one reach another?</w:t>
+      </w:r>
+    </w:p>
+    <w:p>
+      <w:pPr>
+        <w:pStyle w:val="Body"/>
+        <w:keepNext w:val="false"/>
+        <w:ind w:firstLine="340"/>
+      </w:pPr>
+      <w:r>
+        <w:rPr>
+          <w:i w:val="false"/>
+          <w:iCs w:val="false"/>
+        </w:rPr>
+        <w:t xml:space="preserve">Not by a substance that travels. Nothing passes from the human bowl into the preta’s mouth, any more than the flame at dusk rides into the flame at midnight (</w:t>
+      </w:r>
+      <w:r>
+        <w:rPr>
+          <w:i/>
+          <w:iCs/>
+        </w:rPr>
+        <w:t xml:space="preserve">The Architecture of Carrierless Continuity</w:t>
+      </w:r>
+      <w:r>
+        <w:rPr>
+          <w:i w:val="false"/>
+          <w:iCs w:val="false"/>
+        </w:rPr>
+        <w:t xml:space="preserve">). The giving is designated in the human frame: water, a mantra, an intention. The relief is designated in the preta’s frame: nectar where there was pus. The two are linked by dependent arising, as condition in one frame and result in another, and the link is recorded from the frame of the one who gives, the frame that can compare them. This is the structure of the cross-perspective links of §5: agreement and influence across perspectives, with no common object underneath.</w:t>
+      </w:r>
+    </w:p>
+    <w:p>
+      <w:pPr>
+        <w:pStyle w:val="Body"/>
+        <w:keepNext w:val="false"/>
+        <w:ind w:firstLine="340"/>
+      </w:pPr>
+      <w:r>
+        <w:rPr>
+          <w:i w:val="false"/>
+          <w:iCs w:val="false"/>
+        </w:rPr>
+        <w:t xml:space="preserve">Two cautions. The article does not claim to have verified the efficacy of such practices; it asks only what the tradition’s claim would mean without a substrate. And the mantra is not a power residing in sounds, any more than the power to open resides in a key apart from the lock, the hand and the door (Book 4, Chapter 5). It is one condition among conditions, effective, if at all, in the way conditions are.</w:t>
+      </w:r>
+    </w:p>
+    <w:p>
+      <w:pPr>
         <w:pStyle w:val="Heading1"/>
         <w:tabs>
           <w:tab w:val="left" w:pos="454"/>
@@ -3860,7 +4233,7 @@
         <w:rPr>
           <w:color w:val="5A2A1E"/>
         </w:rPr>
-        <w:t xml:space="preserve">6.</w:t>
+        <w:t xml:space="preserve">7.</w:t>
       </w:r>
       <w:r>
         <w:t xml:space="preserve">	</w:t>
@@ -4087,7 +4460,7 @@
         <w:rPr>
           <w:color w:val="5A2A1E"/>
         </w:rPr>
-        <w:t xml:space="preserve">7.</w:t>
+        <w:t xml:space="preserve">8.</w:t>
       </w:r>
       <w:r>
         <w:t xml:space="preserve">	</w:t>
@@ -4532,6 +4905,20 @@
           <w:iCs w:val="false"/>
         </w:rPr>
         <w:t xml:space="preserve">What is eliminated is solely the metaphysical anxiety that demands a foundation—the insistence that beneath the vibrant display of appearances, there must be a dead, unmoving, objective ballast keeping everything upright.</w:t>
+      </w:r>
+    </w:p>
+    <w:p>
+      <w:pPr>
+        <w:pStyle w:val="Body"/>
+        <w:keepNext w:val="false"/>
+        <w:ind w:firstLine="340"/>
+      </w:pPr>
+      <w:r>
+        <w:rPr>
+          <w:i w:val="false"/>
+          <w:iCs w:val="false"/>
+        </w:rPr>
+        <w:t xml:space="preserve">The view has a consequence beyond epistemology. If the preta’s pus is pus for the preta, its suffering is not a mistake to be explained away from a human vantage. No frame owns the real world, so no being’s world can be dismissed as merely its own. This is not relativism: impairment is still corrected within a frame, and pure vision is still less obscured than impure. But it is why compassion makes sense without a self behind it. Other beings’ worlds are as valid for them as this one is for us, and emptiness takes nothing away from their suffering, or from the wish to relieve it.</w:t>
       </w:r>
     </w:p>
     <w:p>

</xml_diff>

<commit_message>
The Illusion of the Given: apply citation corrections from verification
- 2D: cite Viṃśikā v. 3 and MA 6.71 for Candrakīrti's reply on the preta;
  the conventional side attributed to the wider argument, not to 6.71.
- 6D: water reaches the pretas 'as nectar' (not 'rather than as pus');
  cite Amoghavajra's Flaming-Mouth dhāraṇī sūtra, Taishō 1313.
- 4C: Ratnacūḍa-sūtra credited as quoted by Candrakīrti, not as
  Śāntideva's source.

Co-Authored-By: Claude Opus 5.5 <noreply@anthropic.com>
Claude-Session: https://claude.ai/code/session_01MKUz8iyYea4uKKCo6eDwns
</commit_message>
<xml_diff>
--- a/intersubjectivity-and-dependent-arising/The_Illusion_of_the_Given.docx
+++ b/intersubjectivity-and-dependent-arising/The_Illusion_of_the_Given.docx
@@ -1581,7 +1581,7 @@
           <w:i w:val="false"/>
           <w:iCs w:val="false"/>
         </w:rPr>
-        <w:t xml:space="preserve">), Vasubandhu uses the hungry ghosts to answer an objection to Mind-Only. If there are no external objects, why do appearances agree? Why do many beings see the same thing, at the same place and time? His reply: just as hungry ghosts with similar karma together see a river of pus, so the shared ripening of karma in consciousness accounts for shared appearances. No river outside the mind is needed.</w:t>
+        <w:t xml:space="preserve">, v. 3), Vasubandhu uses the hungry ghosts to answer an objection to Mind-Only. If there are no external objects, why do appearances agree? Why do many beings see the same thing, at the same place and time? His reply: just as hungry ghosts with similar karma together see a river of pus, so the shared ripening of karma in consciousness accounts for shared appearances. No river outside the mind is needed.</w:t>
       </w:r>
     </w:p>
     <w:p>
@@ -1595,7 +1595,7 @@
           <w:i w:val="false"/>
           <w:iCs w:val="false"/>
         </w:rPr>
-        <w:t xml:space="preserve">That is this article’s question, answered by making consciousness the floor. Candrakīrti’s examination of Mind-Only (MA 6.45–6.97) turns the example around. If the pus has no standing because it is not external, the cognition of pus has no better standing, since object and cognition are designated together (§2A). For the preta, the river of pus and the seeing of it stand or fall together: conventionally both exist, and under analysis neither is found. So the bowl does not show that the world is in the mind. It shows that neither the world nor the mind is the floor. Shared karma, as karmic vision (</w:t>
+        <w:t xml:space="preserve">That is this article’s question, answered by making consciousness the floor. Candrakīrti’s examination of Mind-Only (MA 6.45–6.97) turns the example around. At MA 6.71 he takes up the preta who sees the river as pus, likens it to the vision of someone with an eye disease, and concludes that as the object does not exist, neither does the mind. If the pus has no standing because it is not external, the cognition of pus has no better standing, since object and cognition are designated together (§2A). For the preta, the river of pus and the seeing of it stand or fall together. The rest of his argument draws the conventional side: in the world’s terms both the object and the mind are accepted, and under analysis neither is found. So the bowl does not show that the world is in the mind. It shows that neither the world nor the mind is the floor. Shared karma, as karmic vision (</w:t>
       </w:r>
       <w:r>
         <w:rPr>
@@ -2599,7 +2599,21 @@
           <w:i w:val="false"/>
           <w:iCs w:val="false"/>
         </w:rPr>
-        <w:t xml:space="preserve">), the argument Śāntideva later made famous in </w:t>
+        <w:t xml:space="preserve">), citing the </w:t>
+      </w:r>
+      <w:r>
+        <w:rPr>
+          <w:i/>
+          <w:iCs/>
+        </w:rPr>
+        <w:t xml:space="preserve">Ratnacūḍa-sūtra</w:t>
+      </w:r>
+      <w:r>
+        <w:rPr>
+          <w:i w:val="false"/>
+          <w:iCs w:val="false"/>
+        </w:rPr>
+        <w:t xml:space="preserve">. Śāntideva later made the argument famous in </w:t>
       </w:r>
       <w:r>
         <w:rPr>
@@ -2613,21 +2627,7 @@
           <w:i w:val="false"/>
           <w:iCs w:val="false"/>
         </w:rPr>
-        <w:t xml:space="preserve"> 9.17–18 (which draws on earlier sutra formulations such as the </w:t>
-      </w:r>
-      <w:r>
-        <w:rPr>
-          <w:i/>
-          <w:iCs/>
-        </w:rPr>
-        <w:t xml:space="preserve">Ratnacūḍa-sūtra</w:t>
-      </w:r>
-      <w:r>
-        <w:rPr>
-          <w:i w:val="false"/>
-          <w:iCs w:val="false"/>
-        </w:rPr>
-        <w:t xml:space="preserve">): an entity cannot act upon itself, just as a sword cannot cut its own blade. Following Candrakīrti, Tsongkhapa makes the rejection of </w:t>
+        <w:t xml:space="preserve"> 9.17–18: an entity cannot act upon itself, just as a sword cannot cut its own blade. Following Candrakīrti, Tsongkhapa makes the rejection of </w:t>
       </w:r>
       <w:r>
         <w:rPr>
@@ -4176,7 +4176,21 @@
           <w:i w:val="false"/>
           <w:iCs w:val="false"/>
         </w:rPr>
-        <w:t xml:space="preserve">The hardest test of the thesis is interaction between worlds, and Buddhist practice assumes it. In offerings of water and food to hungry ghosts, a practitioner blesses water with mantra and gives it, and the tradition holds that it reaches the pretas as nourishment rather than as pus. If each realm’s world arises within its own karmic vision, how can an act in one reach another?</w:t>
+        <w:t xml:space="preserve">The hardest test of the thesis is interaction between worlds, and Buddhist practice assumes it. In offerings of water and food to hungry ghosts, a practitioner blesses water with mantra and gives it, and the tradition holds that it reaches the pretas as nectar. The East Asian rite rests on the </w:t>
+      </w:r>
+      <w:r>
+        <w:rPr>
+          <w:i/>
+          <w:iCs/>
+        </w:rPr>
+        <w:t xml:space="preserve">Sūtra of the Dhāraṇī for Rescuing the Flaming-Mouth Hungry Ghost</w:t>
+      </w:r>
+      <w:r>
+        <w:rPr>
+          <w:i w:val="false"/>
+          <w:iCs w:val="false"/>
+        </w:rPr>
+        <w:t xml:space="preserve">, translated by Amoghavajra (Taishō 1313), in which the dhāraṇī turns food into nectar for them. If each realm’s world arises within its own karmic vision, how can an act in one reach another?</w:t>
       </w:r>
     </w:p>
     <w:p>

</xml_diff>

<commit_message>
The Illusion of the Given: recast 2C as the article's own framing
No source was found stating the Gelug common-basis position with the terms
gzhi mthun / dmigs gzhi tsam. Section 2C now:
- is titled 'A Nominal Observed Basis' rather than 'The Gelug Concession';
- draws the distinction 'in the spirit of Tsongkhapa's reading', citing his
  commentary on MA 6.71 (Illuminating the Intent) only for the preta's
  perception as a karmically conditioned conventional perception;
- marks the Tibetan terms as the article's own analytic terms;
- cites the modern studies of the question: Dorji Wangchuk (2009) and
  Jacob Fisher, Nectar, Water, or Blood? (Oxford DPhil, 2025).
Table 1 is retitled and its headers no longer say 'Gelug'.

Co-Authored-By: Claude Opus 5.5 <noreply@anthropic.com>
Claude-Session: https://claude.ai/code/session_01MKUz8iyYea4uKKCo6eDwns
</commit_message>
<xml_diff>
--- a/intersubjectivity-and-dependent-arising/The_Illusion_of_the_Given.docx
+++ b/intersubjectivity-and-dependent-arising/The_Illusion_of_the_Given.docx
@@ -1193,7 +1193,7 @@
           <w:i w:val="false"/>
           <w:iCs w:val="false"/>
         </w:rPr>
-        <w:t xml:space="preserve">C. The Gelug Concession: What the Nominal Observed Basis Is (</w:t>
+        <w:t xml:space="preserve">C. A Nominal Observed Basis (</w:t>
       </w:r>
       <w:r>
         <w:rPr>
@@ -1234,7 +1234,35 @@
           <w:i w:val="false"/>
           <w:iCs w:val="false"/>
         </w:rPr>
-        <w:t xml:space="preserve">), a Gelug reading, following Tsongkhapa, draws a vital distinction:</w:t>
+        <w:t xml:space="preserve">), this article draws a distinction in the spirit of Tsongkhapa’s reading. In his commentary on MA 6.71 (</w:t>
+      </w:r>
+      <w:r>
+        <w:rPr>
+          <w:i/>
+          <w:iCs/>
+        </w:rPr>
+        <w:t xml:space="preserve">Illuminating the Intent</w:t>
+      </w:r>
+      <w:r>
+        <w:rPr>
+          <w:i w:val="false"/>
+          <w:iCs w:val="false"/>
+        </w:rPr>
+        <w:t xml:space="preserve">), the preta’s perception of the river as pus is treated as a conventional perception conditioned by karma, not as a mere error. The Tibetan terms in the table below are the article’s own analytic terms, not a formula quoted from a Gelug text. The wider question, how beings of different realms perceive what is for us one entity, is studied by Dorji Wangchuk (2009) and in Jacob Fisher’s </w:t>
+      </w:r>
+      <w:r>
+        <w:rPr>
+          <w:i/>
+          <w:iCs/>
+        </w:rPr>
+        <w:t xml:space="preserve">Nectar, Water, or Blood?</w:t>
+      </w:r>
+      <w:r>
+        <w:rPr>
+          <w:i w:val="false"/>
+          <w:iCs w:val="false"/>
+        </w:rPr>
+        <w:t xml:space="preserve"> (2025), which ends with Tsongkhapa’s much-debated reading of the example.</w:t>
       </w:r>
     </w:p>
     <w:p>
@@ -1242,7 +1270,7 @@
         <w:pStyle w:val="Caption"/>
       </w:pPr>
       <w:r>
-        <w:t xml:space="preserve">Table 1. The Gelug distinction on the common basis</w:t>
+        <w:t xml:space="preserve">Table 1. The common basis: what is negated and what is accepted</w:t>
       </w:r>
     </w:p>
     <w:tbl>
@@ -1291,7 +1319,7 @@
                 <w:i w:val="false"/>
                 <w:iCs w:val="false"/>
               </w:rPr>
-              <w:t xml:space="preserve">What Gelug Strictly Negates</w:t>
+              <w:t xml:space="preserve">What Is Negated</w:t>
             </w:r>
           </w:p>
         </w:tc>
@@ -1321,7 +1349,7 @@
                 <w:i w:val="false"/>
                 <w:iCs w:val="false"/>
               </w:rPr>
-              <w:t xml:space="preserve">What Gelug Conventionally Accepts</w:t>
+              <w:t xml:space="preserve">What Is Conventionally Accepted</w:t>
             </w:r>
           </w:p>
         </w:tc>

</xml_diff>